<commit_message>
docs: regenerate shop reset current stock docx
Co-authored-by: Sonic-Media <Sonic-Media@users.noreply.github.com>
</commit_message>
<xml_diff>
--- a/docs/data-integrity/SHOP-RESET-CURRENT-STOCK-FIX-REPORT.docx
+++ b/docs/data-integrity/SHOP-RESET-CURRENT-STOCK-FIX-REPORT.docx
@@ -13,6 +13,11 @@
     <w:p>
       <w:r>
         <w:t>**Branch:** `cursor/shop-reset-current-stock-fix-b6e7`</w:t>
+      </w:r>
+    </w:p>
+    <w:p>
+      <w:r>
+        <w:t>**Commit:** `f3a0cf6`</w:t>
       </w:r>
     </w:p>
     <w:p>

</xml_diff>